<commit_message>
v0.9.6: modo por defecto Simon Dice + informe APA 7 (Inter/Schematic) + docs
</commit_message>
<xml_diff>
--- a/Informe_PicoReflex.docx
+++ b/Informe_PicoReflex.docx
@@ -40,17 +40,22 @@
     </w:p>
     <w:p>
       <w:r>
-        <w:t>PicoReflex es un dispositivo de entrenamiento de reflejos (juego de reacción) construido sobre una Raspberry Pi Pico W. El sistema enciende de forma aleatoria uno de cinco LEDs y mide, con resolución de microsegundos, el tiempo que tarda el jugador en pulsar el botón asociado a ese LED.</w:t>
+        <w:t>PicoReflex es un dispositivo de entrenamiento de reflejos (juego de reacción) construido sobre una Raspberry Pi Pico W (Raspberry Pi Ltd, 2023). El sistema enciende de forma aleatoria uno de cinco LEDs y mide, con resolución de microsegundos, el tiempo que tarda el jugador en pulsar el botón asociado a ese LED.</w:t>
       </w:r>
     </w:p>
     <w:p>
       <w:r>
-        <w:t>Incluye tres modos de juego (entrenamiento libre, contrarreloj y muerte súbita) y tres niveles de dificultad (tolerancia de 1000 / 500 / 250 ms). La secuencia de LEDs puede generarse con una semilla fija (reproducible) o aleatoria. Todo el dispositivo es configurable y supervisable desde un servidor web embebido (Wi-Fi, lwIP) sin recompilar el firmware, y soporta actualización de firmware por aire (OTA A/B con rollback).</w:t>
+        <w:t>Incluye cuatro modos de juego (entrenamiento libre, contrarreloj, muerte súbita y Simón Dice) y tres niveles de dificultad (tolerancia de 1000 / 500 / 250 ms). La secuencia de LEDs puede generarse con una semilla fija (reproducible) o aleatoria. Todo el dispositivo es configurable y supervisable desde un servidor web embebido (Wi-Fi, lwIP) sin recompilar el firmware, y soporta actualización de firmware por aire (OTA A/B con rollback).</w:t>
       </w:r>
     </w:p>
     <w:p>
       <w:r>
-        <w:t>El firmware usa FreeRTOS en dos núcleos: el núcleo 0 ejecuta la lógica del juego (máquina de estados, temporización por interrupción y PRNG) y el núcleo 1 gestiona la red (Wi-Fi/AP), el servidor web y el refresco del display OLED.</w:t>
+        <w:t>El firmware usa FreeRTOS (Real Time Engineers Ltd, n.d.) en dos núcleos: el núcleo 0 ejecuta la lógica del juego (máquina de estados, temporización por interrupción y PRNG) y el núcleo 1 gestiona la red (Wi-Fi/AP), el servidor web y el refresco del display OLED.</w:t>
+      </w:r>
+    </w:p>
+    <w:p>
+      <w:r>
+        <w:t>El modo de juego, la dificultad y la semilla se persisten en Flash (formato v7), de modo que al reiniciar se recupera la configuración anterior en lugar de volver a los valores por defecto. El controlador del display OLED —SSD1306 (0.96") o SH1106 (1.3")— se selecciona en runtime desde la interfaz web y también se persiste. Desde el estado de reposo, la ronda arranca pulsando cualquiera de los cinco botones.</w:t>
       </w:r>
     </w:p>
     <w:p>
@@ -77,7 +82,7 @@
         <w:t xml:space="preserve">Raspberry Pi Pico W: </w:t>
       </w:r>
       <w:r>
-        <w:t>RP2040 (doble núcleo Cortex-M0+) + chip inalámbrico CYW43 (Wi-Fi 2.4 GHz).</w:t>
+        <w:t>RP2040 (doble núcleo Cortex-M0+, Raspberry Pi Ltd, 2024) + chip inalámbrico CYW43 (Wi-Fi 2.4 GHz, Infineon Technologies, n.d.).</w:t>
       </w:r>
     </w:p>
     <w:p>
@@ -119,7 +124,7 @@
         <w:t xml:space="preserve">Display OLED 128×64: </w:t>
       </w:r>
       <w:r>
-        <w:t>I2C1 (SDA=GPIO14, SCL=GPIO15, 400 kHz, dirección 0x3C/0x3D). Compatible SSD1306 (0.96") y SH1106 (1.3").</w:t>
+        <w:t>I2C1 (SDA=GPIO14, SCL=GPIO15, 400 kHz, dirección 0x3C/0x3D). Compatible SSD1306 (0.96", Solomon Systech, 2008) y SH1106 (1.3", Sino Wealth, n.d.).</w:t>
       </w:r>
     </w:p>
     <w:p>
@@ -340,6 +345,57 @@
       </w:r>
     </w:p>
     <w:p/>
+    <w:p>
+      <w:pPr>
+        <w:jc w:val="center"/>
+      </w:pPr>
+      <w:r>
+        <w:drawing>
+          <wp:inline xmlns:a="http://schemas.openxmlformats.org/drawingml/2006/main" xmlns:pic="http://schemas.openxmlformats.org/drawingml/2006/picture">
+            <wp:extent cx="5715000" cy="4148667"/>
+            <wp:docPr id="1" name="Picture 1"/>
+            <wp:cNvGraphicFramePr>
+              <a:graphicFrameLocks noChangeAspect="1"/>
+            </wp:cNvGraphicFramePr>
+            <a:graphic>
+              <a:graphicData uri="http://schemas.openxmlformats.org/drawingml/2006/picture">
+                <pic:pic>
+                  <pic:nvPicPr>
+                    <pic:cNvPr id="0" name="Schematic.png"/>
+                    <pic:cNvPicPr/>
+                  </pic:nvPicPr>
+                  <pic:blipFill>
+                    <a:blip r:embed="rId9"/>
+                    <a:stretch>
+                      <a:fillRect/>
+                    </a:stretch>
+                  </pic:blipFill>
+                  <pic:spPr>
+                    <a:xfrm>
+                      <a:off x="0" y="0"/>
+                      <a:ext cx="5715000" cy="4148667"/>
+                    </a:xfrm>
+                    <a:prstGeom prst="rect"/>
+                  </pic:spPr>
+                </pic:pic>
+              </a:graphicData>
+            </a:graphic>
+          </wp:inline>
+        </w:drawing>
+      </w:r>
+    </w:p>
+    <w:p>
+      <w:pPr>
+        <w:jc w:val="center"/>
+      </w:pPr>
+      <w:r>
+        <w:rPr>
+          <w:i/>
+          <w:sz w:val="18"/>
+        </w:rPr>
+        <w:t>Figura 1. Esquema circuital del PicoReflex (Schematic.svg).</w:t>
+      </w:r>
+    </w:p>
     <w:tbl>
       <w:tblPr>
         <w:tblStyle w:val="LightGrid-Accent1"/>
@@ -593,7 +649,7 @@
         <w:t xml:space="preserve">Nota de alimentación: </w:t>
       </w:r>
       <w:r>
-        <w:t>el display OLED es de 3.3 V. Conectar VCC → 3V3(OUT) (pin 36) y GND → GND; nunca a VBUS (5 V), que puede dañar el módulo y llevar 5 V a los GPIO14/15.</w:t>
+        <w:t>el fabricante del módulo OLED indica un rango de 3.3–5 V, pero se recomienda VCC → 3V3(OUT) (pin 36) y GND → GND: alimentar a 5 V (VBUS, pin 40) puede llevar 5 V a los GPIO14/15 (I2C) a través de los pull-up y dañar el RP2040.</w:t>
       </w:r>
     </w:p>
     <w:p>
@@ -828,6 +884,102 @@
         <w:t>Con el auto-test 'Display All ON' (0xA5) durante 1 s, el chip devuelve ACK pero el panel no emite destello: el controlador está vivo pero el panel no enciende. Es un defecto físico del módulo (charge-pump/DC-DC muerto o flex agrietado), no reparable por software; se documentó el método de diagnóstico para separar este caso del de RAM/direccionamiento.</w:t>
       </w:r>
     </w:p>
+    <w:p>
+      <w:r>
+        <w:rPr>
+          <w:b/>
+        </w:rPr>
+        <w:t>15. Modo y dificultad volvían a los valores por defecto al reiniciar</w:t>
+      </w:r>
+    </w:p>
+    <w:p>
+      <w:pPr>
+        <w:spacing w:after="160"/>
+      </w:pPr>
+      <w:r>
+        <w:t>Solo se persistían el nombre, el ranking y las credenciales Wi-Fi. Se amplió el formato de Flash (PersistentData v6→v7) con game_mode, game_difficulty, seed, round_seconds y stimulus_min/max, restaurados al arrancar; además, el disparador de inicio acepta ahora cualquiera de los cinco botones desde el estado de reposo.</w:t>
+      </w:r>
+    </w:p>
+    <w:p>
+      <w:pPr>
+        <w:pStyle w:val="Heading1"/>
+      </w:pPr>
+      <w:r>
+        <w:t>Referencias</w:t>
+      </w:r>
+    </w:p>
+    <w:p>
+      <w:pPr>
+        <w:spacing w:after="120"/>
+        <w:ind w:left="720" w:hanging="720"/>
+      </w:pPr>
+      <w:r>
+        <w:t>Dunkels, A. (2001). *lwIP — A lightweight TCP/IP stack*. https://savannah.nongnu.org/projects/lwip/</w:t>
+      </w:r>
+    </w:p>
+    <w:p>
+      <w:pPr>
+        <w:spacing w:after="120"/>
+        <w:ind w:left="720" w:hanging="720"/>
+      </w:pPr>
+      <w:r>
+        <w:t>Infineon Technologies. (n.d.). *CYW43439: Single-chip IEEE 802.11 b/g/n wireless LAN and Bluetooth 5.1 combo*. https://www.infineon.com/</w:t>
+      </w:r>
+    </w:p>
+    <w:p>
+      <w:pPr>
+        <w:spacing w:after="120"/>
+        <w:ind w:left="720" w:hanging="720"/>
+      </w:pPr>
+      <w:r>
+        <w:t>Raspberry Pi Ltd. (2023). *Raspberry Pi Pico W datasheet*. https://datasheets.raspberrypi.com/picow/pico-w-datasheet.pdf</w:t>
+      </w:r>
+    </w:p>
+    <w:p>
+      <w:pPr>
+        <w:spacing w:after="120"/>
+        <w:ind w:left="720" w:hanging="720"/>
+      </w:pPr>
+      <w:r>
+        <w:t>Raspberry Pi Ltd. (2024). *RP2040 datasheet: A microcontroller by Raspberry Pi*. https://datasheets.raspberrypi.com/rp2040/rp2040-datasheet.pdf</w:t>
+      </w:r>
+    </w:p>
+    <w:p>
+      <w:pPr>
+        <w:spacing w:after="120"/>
+        <w:ind w:left="720" w:hanging="720"/>
+      </w:pPr>
+      <w:r>
+        <w:t>Raspberry Pi Ltd. (2025). *Pico SDK documentation* (versión 2.3.0). https://www.raspberrypi.com/documentation/pico-sdk/</w:t>
+      </w:r>
+    </w:p>
+    <w:p>
+      <w:pPr>
+        <w:spacing w:after="120"/>
+        <w:ind w:left="720" w:hanging="720"/>
+      </w:pPr>
+      <w:r>
+        <w:t>Real Time Engineers Ltd. (n.d.). *FreeRTOS: Real-time operating system for microcontrollers*. https://www.freertos.org/</w:t>
+      </w:r>
+    </w:p>
+    <w:p>
+      <w:pPr>
+        <w:spacing w:after="120"/>
+        <w:ind w:left="720" w:hanging="720"/>
+      </w:pPr>
+      <w:r>
+        <w:t>Sino Wealth. (n.d.). *SH1106: 132 × 64 dot matrix OLED/PLED segment/common driver with controller*. https://www.displayfuture.com/Display/datasheet/controller/SH1106.pdf</w:t>
+      </w:r>
+    </w:p>
+    <w:p>
+      <w:pPr>
+        <w:spacing w:after="120"/>
+        <w:ind w:left="720" w:hanging="720"/>
+      </w:pPr>
+      <w:r>
+        <w:t>Solomon Systech. (2008). *SSD1306: 128 × 64 dot matrix OLED/PLED segment/common driver with controller* (Rev. 2.2). https://cdn-shop.adafruit.com/datasheets/SSD1306.pdf</w:t>
+      </w:r>
+    </w:p>
     <w:sectPr>
       <w:pgSz w:w="12240" w:h="15840"/>
       <w:pgMar w:top="1440" w:right="1800" w:bottom="1440" w:left="1800" w:header="720" w:footer="720" w:gutter="0"/>
@@ -1202,7 +1354,7 @@
     <w:qFormat/>
     <w:rsid w:val="00FC693F"/>
     <w:rPr>
-      <w:rFonts w:ascii="Calibri" w:hAnsi="Calibri"/>
+      <w:rFonts w:ascii="Inter" w:hAnsi="Inter" w:cs="Inter"/>
       <w:sz w:val="22"/>
     </w:rPr>
   </w:style>

</xml_diff>

<commit_message>
docs: informe Word con descargo de IA + ref buzzer PWM
</commit_message>
<xml_diff>
--- a/Informe_PicoReflex.docx
+++ b/Informe_PicoReflex.docx
@@ -959,6 +959,15 @@
         <w:ind w:left="720" w:hanging="720"/>
       </w:pPr>
       <w:r>
+        <w:t>Raspberry Pi Ltd. (2025). *Pico SDK: hardware_pwm* (PWM para buzzer pasivo). https://www.raspberrypi.com/documentation/pico-sdk/hardware.html#hardware_pwm</w:t>
+      </w:r>
+    </w:p>
+    <w:p>
+      <w:pPr>
+        <w:spacing w:after="120"/>
+        <w:ind w:left="720" w:hanging="720"/>
+      </w:pPr>
+      <w:r>
         <w:t>Real Time Engineers Ltd. (n.d.). *FreeRTOS: Real-time operating system for microcontrollers*. https://www.freertos.org/</w:t>
       </w:r>
     </w:p>
@@ -978,6 +987,19 @@
       </w:pPr>
       <w:r>
         <w:t>Solomon Systech. (2008). *SSD1306: 128 × 64 dot matrix OLED/PLED segment/common driver with controller* (Rev. 2.2). https://cdn-shop.adafruit.com/datasheets/SSD1306.pdf</w:t>
+      </w:r>
+    </w:p>
+    <w:p>
+      <w:pPr>
+        <w:pStyle w:val="Heading1"/>
+      </w:pPr>
+      <w:r>
+        <w:t>Aclaración sobre el uso de inteligencia artificial</w:t>
+      </w:r>
+    </w:p>
+    <w:p>
+      <w:r>
+        <w:t>Se deja constancia de que se utilizó una herramienta de inteligencia artificial como asistencia para el formato y la presentación del documento, así como para la revisión y corrección ortográfica y gramatical del texto. El contenido técnico, los cálculos, las ecuaciones y las comparaciones se presentan conforme al desarrollo del trabajo práctico y a los análisis realizados.</w:t>
       </w:r>
     </w:p>
     <w:sectPr>

</xml_diff>

<commit_message>
docs: renombrar Schematic.svg a Esquemático.svg y añadir SVG nuevos (bloques, flujos, qué es) + pinout actualizado + links Word/README
</commit_message>
<xml_diff>
--- a/Informe_PicoReflex.docx
+++ b/Informe_PicoReflex.docx
@@ -1002,6 +1002,56 @@
         <w:t>Se deja constancia de que se utilizó una herramienta de inteligencia artificial como asistencia para el formato y la presentación del documento, así como para la revisión y corrección ortográfica y gramatical del texto. El contenido técnico, los cálculos, las ecuaciones y las comparaciones se presentan conforme al desarrollo del trabajo práctico y a los análisis realizados.</w:t>
       </w:r>
     </w:p>
+    <w:p>
+      <w:pPr>
+        <w:pStyle w:val="Heading1"/>
+      </w:pPr>
+      <w:r>
+        <w:t>Enlaces</w:t>
+      </w:r>
+    </w:p>
+    <w:p>
+      <w:pPr>
+        <w:pStyle w:val="ListBullet"/>
+      </w:pPr>
+      <w:r>
+        <w:rPr>
+          <w:b/>
+        </w:rPr>
+        <w:t xml:space="preserve">Documentación (sitio MkDocs): </w:t>
+      </w:r>
+      <w:r>
+        <w:t>https://alessandroklein.github.io/Docs/picoreflex/</w:t>
+      </w:r>
+    </w:p>
+    <w:p>
+      <w:pPr>
+        <w:pStyle w:val="ListBullet"/>
+      </w:pPr>
+      <w:r>
+        <w:rPr>
+          <w:b/>
+        </w:rPr>
+        <w:t xml:space="preserve">Repositorio del código: </w:t>
+      </w:r>
+      <w:r>
+        <w:t>https://github.com/AlessandroKlein/PicoReflex</w:t>
+      </w:r>
+    </w:p>
+    <w:p>
+      <w:pPr>
+        <w:pStyle w:val="ListBullet"/>
+      </w:pPr>
+      <w:r>
+        <w:rPr>
+          <w:b/>
+        </w:rPr>
+        <w:t xml:space="preserve">Repositorio de la documentación: </w:t>
+      </w:r>
+      <w:r>
+        <w:t>https://github.com/AlessandroKlein/Docs</w:t>
+      </w:r>
+    </w:p>
     <w:sectPr>
       <w:pgSz w:w="12240" w:h="15840"/>
       <w:pgMar w:top="1440" w:right="1800" w:bottom="1440" w:left="1800" w:header="720" w:footer="720" w:gutter="0"/>

</xml_diff>